<commit_message>
Update frontend handoff doc v1.1 with refresh token and forgot password
Document new Auth endpoints and updated login response shape for the frontend team.

Co-authored-by: Cursor <cursoragent@cursor.com>
</commit_message>
<xml_diff>
--- a/docs/Frontend_Production_Handoff.docx
+++ b/docs/Frontend_Production_Handoff.docx
@@ -80,7 +80,7 @@
           </w:tcPr>
           <w:p>
             <w:r>
-              <w:t>1.0</w:t>
+              <w:t>1.1</w:t>
             </w:r>
           </w:p>
         </w:tc>
@@ -103,7 +103,7 @@
           </w:tcPr>
           <w:p>
             <w:r>
-              <w:t>29 July 2026</w:t>
+              <w:t>29 July 2026 (evening — refresh token + forgot password added)</w:t>
             </w:r>
           </w:p>
         </w:tc>
@@ -1936,7 +1936,7 @@
         <w:color w:val="666666"/>
         <w:sz w:val="16"/>
       </w:rPr>
-      <w:t xml:space="preserve">© Nexus Lexis · nexuslexis.law  |  Updated: 29 July 2026  |  Page </w:t>
+      <w:t xml:space="preserve">© Nexus Lexis · nexuslexis.law  |  Updated: 29 July 2026 (evening — refresh token + forgot password added)  |  Page </w:t>
     </w:r>
     <w:r>
       <w:rPr>
@@ -1963,7 +1963,7 @@
         <w:color w:val="666666"/>
         <w:sz w:val="16"/>
       </w:rPr>
-      <w:t>Nexus Lexis — Frontend Production Integration Handoff  |  NL-FE-PROD-001  |  v1.0  |  Internal — Frontend Team</w:t>
+      <w:t>Nexus Lexis — Frontend Production Integration Handoff  |  NL-FE-PROD-001  |  v1.1  |  Internal — Frontend Team</w:t>
     </w:r>
   </w:p>
 </w:hdr>

</xml_diff>